<commit_message>
Ajoute le dossier Bloc 3 et sa grille de critères d'évaluation
- docs/Bloc_3.docx : dossier RNCP39586 Bloc 3 (piloter un projet DATA)
- docs/criteres_evaluation.md : grille des critères Bloc 3 (C3.1 à C3.4) avec mapping
  vers le dépôt (gouvernance de branches, restriction de périmètre SNCF, veille
  Dependabot, RGPD/accessibilité)

Co-Authored-By: Claude Sonnet 5 <noreply@anthropic.com>
Claude-Session: https://claude.ai/code/session_01TM9eAFs33jCP4yR6ecyDWF
</commit_message>
<xml_diff>
--- a/docs/Bloc_2.docx
+++ b/docs/Bloc_2.docx
@@ -8960,12 +8960,12 @@
           <wp:inline distB="0" distT="0" distL="114300" distR="114300">
             <wp:extent cx="4406738" cy="2524508"/>
             <wp:effectExtent b="0" l="0" r="0" t="0"/>
-            <wp:docPr id="3" name="image2.png"/>
+            <wp:docPr id="3" name="image5.png"/>
             <a:graphic>
               <a:graphicData uri="http://schemas.openxmlformats.org/drawingml/2006/picture">
                 <pic:pic>
                   <pic:nvPicPr>
-                    <pic:cNvPr id="0" name="image2.png"/>
+                    <pic:cNvPr id="0" name="image5.png"/>
                     <pic:cNvPicPr preferRelativeResize="0"/>
                   </pic:nvPicPr>
                   <pic:blipFill>
@@ -9061,12 +9061,12 @@
           <wp:inline distB="0" distT="0" distL="114300" distR="114300">
             <wp:extent cx="5176838" cy="2219325"/>
             <wp:effectExtent b="0" l="0" r="0" t="0"/>
-            <wp:docPr id="4" name="image5.png"/>
+            <wp:docPr id="4" name="image4.png"/>
             <a:graphic>
               <a:graphicData uri="http://schemas.openxmlformats.org/drawingml/2006/picture">
                 <pic:pic>
                   <pic:nvPicPr>
-                    <pic:cNvPr id="0" name="image5.png"/>
+                    <pic:cNvPr id="0" name="image4.png"/>
                     <pic:cNvPicPr preferRelativeResize="0"/>
                   </pic:nvPicPr>
                   <pic:blipFill>
@@ -9145,12 +9145,12 @@
           <wp:inline distB="0" distT="0" distL="114300" distR="114300">
             <wp:extent cx="5154450" cy="1657350"/>
             <wp:effectExtent b="0" l="0" r="0" t="0"/>
-            <wp:docPr id="5" name="image4.png"/>
+            <wp:docPr id="5" name="image1.png"/>
             <a:graphic>
               <a:graphicData uri="http://schemas.openxmlformats.org/drawingml/2006/picture">
                 <pic:pic>
                   <pic:nvPicPr>
-                    <pic:cNvPr id="0" name="image4.png"/>
+                    <pic:cNvPr id="0" name="image1.png"/>
                     <pic:cNvPicPr preferRelativeResize="0"/>
                   </pic:nvPicPr>
                   <pic:blipFill>
@@ -9234,12 +9234,12 @@
           <wp:inline distB="0" distT="0" distL="114300" distR="114300">
             <wp:extent cx="5046825" cy="3228975"/>
             <wp:effectExtent b="0" l="0" r="0" t="0"/>
-            <wp:docPr id="2" name="image3.png"/>
+            <wp:docPr id="2" name="image2.png"/>
             <a:graphic>
               <a:graphicData uri="http://schemas.openxmlformats.org/drawingml/2006/picture">
                 <pic:pic>
                   <pic:nvPicPr>
-                    <pic:cNvPr id="0" name="image3.png"/>
+                    <pic:cNvPr id="0" name="image2.png"/>
                     <pic:cNvPicPr preferRelativeResize="0"/>
                   </pic:nvPicPr>
                   <pic:blipFill>
@@ -9309,12 +9309,12 @@
           <wp:inline distB="114300" distT="114300" distL="114300" distR="114300">
             <wp:extent cx="4710113" cy="4502976"/>
             <wp:effectExtent b="0" l="0" r="0" t="0"/>
-            <wp:docPr id="1" name="image1.png"/>
+            <wp:docPr id="1" name="image3.png"/>
             <a:graphic>
               <a:graphicData uri="http://schemas.openxmlformats.org/drawingml/2006/picture">
                 <pic:pic>
                   <pic:nvPicPr>
-                    <pic:cNvPr id="0" name="image1.png"/>
+                    <pic:cNvPr id="0" name="image3.png"/>
                     <pic:cNvPicPr preferRelativeResize="0"/>
                   </pic:nvPicPr>
                   <pic:blipFill>

</xml_diff>